<commit_message>
Add readme files and main
</commit_message>
<xml_diff>
--- a/results/H1/table_06_lmm_total_score.docx
+++ b/results/H1/table_06_lmm_total_score.docx
@@ -28,7 +28,7 @@
         <w:rPr/>
         <w:t xml:space="preserve">Table </w:t>
       </w:r>
-      <w:bookmarkStart w:id="2005298a-cf6d-440a-bd35-21c044e6ba28" w:name="table"/>
+      <w:bookmarkStart w:id="a0602ce4-eb67-4ea6-bd40-1a635d20c5be" w:name="table"/>
       <w:r>
         <w:rPr/>
         <w:fldChar w:fldCharType="begin" w:dirty="true"/>
@@ -41,7 +41,7 @@
         <w:rPr/>
         <w:fldChar w:fldCharType="end" w:dirty="true"/>
       </w:r>
-      <w:bookmarkEnd w:id="2005298a-cf6d-440a-bd35-21c044e6ba28"/>
+      <w:bookmarkEnd w:id="a0602ce4-eb67-4ea6-bd40-1a635d20c5be"/>
       <w:r>
         <w:rPr/>
         <w:t xml:space="preserve">. </w:t>

</xml_diff>